<commit_message>
Android 5.7.60 live on Play: tester pages v15/v21/v14/v19/v21/v17 + core test plan
</commit_message>
<xml_diff>
--- a/downloads/knokkeroo-tester-test-plan-core.docx
+++ b/downloads/knokkeroo-tester-test-plan-core.docx
@@ -66,7 +66,7 @@
           </w:tcPr>
           <w:p>
             <w:r>
-              <w:t>Live production app — Android 5.7.59, iOS 5.7.59, Huawei 5.7.34 (read from the Play publisher API, the public iTunes lookup and the AppGallery Connect status read on 15 September 2026). iPhone and Android are level: Google Play has served 5.7.59 since 13 September 2026 (release “5.7.59 + Android TV 1.0.0”, versionCodes 62 and 900000001, status completed), and Apple approved and released 5.7.59 to the App Store at 23:59 UTC the same day, replacing 5.7.55. Huawei is four rounds behind on 5.7.34, and nothing newer is with its reviewers. What 5.7.59 changes for a tester: the app no longer records a check-in on its own while the phone sits idle — a check-in happens only when you do something (knok, open the app, widget, watch, TV); on 5.7.59 a phone left untouched must NOT advance its own last-knok time. Huawei 5.7.34 still has the old automatic check-in</w:t>
+              <w:t>Live production app — Android 5.7.60, iOS 5.7.59, Huawei 5.7.34 (read from the Play publisher API, the public iTunes lookup and the AppGallery Connect status read on 15 September 2026). iPhone and Android are level: Google Play has served 5.7.59 since 13 September 2026 (release “5.7.59 + Android TV 1.0.0”, versionCodes 62 and 900000001, status completed), and Apple approved and released 5.7.59 to the App Store at 23:59 UTC the same day, replacing 5.7.55. Huawei is four rounds behind on 5.7.34, and nothing newer is with its reviewers. What 5.7.59 changes for a tester: the app no longer records a check-in on its own while the phone sits idle — a check-in happens only when you do something (knok, open the app, widget, watch, TV); on 5.7.59 a phone left untouched must NOT advance its own last-knok time. Huawei 5.7.34 still has the old automatic check-in</w:t>
             </w:r>
           </w:p>
         </w:tc>
@@ -116,7 +116,7 @@
           </w:tcPr>
           <w:p>
             <w:r>
-              <w:t>15 September 2026</w:t>
+              <w:t>20 September 2026</w:t>
             </w:r>
           </w:p>
         </w:tc>

</xml_diff>